<commit_message>
Implementação melhorias e fase 3 e 4
</commit_message>
<xml_diff>
--- a/contexto_com_imagens.docx
+++ b/contexto_com_imagens.docx
@@ -20,7 +20,7 @@
           <w:i w:val="true"/>
           <w:sz w:val="20"/>
         </w:rPr>
-        <w:t>Gerado em: Mon Apr 20 20:33:11 GMT-03:00 2026</w:t>
+        <w:t>Gerado em: Tue Apr 21 20:41:55 GMT-03:00 2026</w:t>
       </w:r>
     </w:p>
     <w:p/>
@@ -31,7 +31,7 @@
           <w:color w:val="0066CC"/>
           <w:sz w:val="24"/>
         </w:rPr>
-        <w:t>URL: https://github.com/Dimitri74/Back-End_JMS-WEBSHERE-LIBERTY-JAVA-8--EJB3_ANGULAR/blob/main/README.md</w:t>
+        <w:t>URL: https://github.com/Dimitri74/Expert_DEV/blob/main/RELATORIO_IMPLEMENTACAO.md</w:t>
       </w:r>
     </w:p>
     <w:p>
@@ -39,18 +39,18 @@
         <w:rPr>
           <w:sz w:val="22"/>
         </w:rPr>
-        <w:t># Projeto SICOB - Teste de JMS com Angular e EJB
-## 📋 Visão Geral
-Este repositório contém uma solução completa de estudo de caso para demonstrar a integração entre **Frontend Angular**, **Backend EJB/JPA** e **Mensageria JMS** usando a plataforma **IBM Liberty**.
-A arquitetura foi desenvolvida para validar padrões de comunicação assíncrona com Message-Driven Beans em um ambiente empresarial.
----
-## 🏗️ Arquitetura
-```
-┌─────────────────┐
-│ Frontend │
-│ Angular │
-└────────┬────────┘
- │ API...</w:t>
+        <w:t># Expert Dev - Resumo de Implementação (VR1.1 até VR1.5)
+## Timeline de Evolução
+### VR1.1 (2024 - MVP com Robustez)
+- ✅ Validação de URLs com saneamento
+- ✅ Tratamento de erro por URL (não quebra lote inteiro)
+- ✅ Deduplicação de imagens
+- ✅ Prompt revisado e consistente
+- ✅ Relatório `resumo_execucao.txt`
+- ✅ Arquivo `erros_processamento.txt`
+### VR1.3 (2024 - Modularização e Configuração)
+- ✅ Separação em 14+ classes (config, models, services, io)
+- ✅ Suporte a configuração externa via `ex...</w:t>
       </w:r>
     </w:p>
     <w:p/>

</xml_diff>

<commit_message>
aprimoramento da aba Performance&ROI, gestão de histórico e melhorias na UI de login
</commit_message>
<xml_diff>
--- a/contexto_com_imagens.docx
+++ b/contexto_com_imagens.docx
@@ -20,7 +20,7 @@
           <w:i w:val="true"/>
           <w:sz w:val="20"/>
         </w:rPr>
-        <w:t>Gerado em: Tue Apr 21 20:41:55 GMT-03:00 2026</w:t>
+        <w:t>Gerado em: Wed Apr 22 16:39:58 GMT-03:00 2026</w:t>
       </w:r>
     </w:p>
     <w:p/>
@@ -31,7 +31,17 @@
           <w:color w:val="0066CC"/>
           <w:sz w:val="24"/>
         </w:rPr>
-        <w:t>URL: https://github.com/Dimitri74/Expert_DEV/blob/main/RELATORIO_IMPLEMENTACAO.md</w:t>
+        <w:t>URL: https://github.com/unipds-projetos/modulo1-fundamentos-java-extra-cardapio/blob/main/README.md</w:t>
+      </w:r>
+    </w:p>
+    <w:p>
+      <w:r>
+        <w:rPr>
+          <w:i w:val="true"/>
+          <w:color w:val="FF6600"/>
+          <w:sz w:val="20"/>
+        </w:rPr>
+        <w:t>Observação: Recuperado do cache em 2026-04-22 18:17:11.0</w:t>
       </w:r>
     </w:p>
     <w:p>
@@ -39,18 +49,17 @@
         <w:rPr>
           <w:sz w:val="22"/>
         </w:rPr>
-        <w:t># Expert Dev - Resumo de Implementação (VR1.1 até VR1.5)
-## Timeline de Evolução
-### VR1.1 (2024 - MVP com Robustez)
-- ✅ Validação de URLs com saneamento
-- ✅ Tratamento de erro por URL (não quebra lote inteiro)
-- ✅ Deduplicação de imagens
-- ✅ Prompt revisado e consistente
-- ✅ Relatório `resumo_execucao.txt`
-- ✅ Arquivo `erros_processamento.txt`
-### VR1.3 (2024 - Modularização e Configuração)
-- ✅ Separação em 14+ classes (config, models, services, io)
-- ✅ Suporte a configuração externa via `ex...</w:t>
+        <w:t># Cardápio
+Este é um projeto simples em Java que demonstra como utilizar a biblioteca Gson para converter um objeto que representa um item de cardápio em uma string JSON.
+## Tecnologias Utilizadas
+* **Java:** Linguagem de programação principal.
+* **Gradle:** Ferramenta de automação de compilação.
+* **Gson:** Biblioteca do Google para trabalhar com JSON em Java.
+## Como Executar
+Você pode construir e executar o projeto utilizando o Gradle Wrapper fornecido.
+**Linux/macOS:**
+```bash
+./gradle...</w:t>
       </w:r>
     </w:p>
     <w:p/>

</xml_diff>

<commit_message>
Ajuste do extrator e Prompt a ser gerado
</commit_message>
<xml_diff>
--- a/contexto_com_imagens.docx
+++ b/contexto_com_imagens.docx
@@ -20,7 +20,7 @@
           <w:i w:val="true"/>
           <w:sz w:val="20"/>
         </w:rPr>
-        <w:t>Gerado em: Mon Apr 27 18:10:14 GMT-03:00 2026</w:t>
+        <w:t>Gerado em: Sat May 02 14:37:39 GMT-03:00 2026</w:t>
       </w:r>
     </w:p>
     <w:p/>
@@ -31,7 +31,7 @@
           <w:color w:val="0066CC"/>
           <w:sz w:val="24"/>
         </w:rPr>
-        <w:t>URL: upload://SIPCS_Msg_Sistema.doc</w:t>
+        <w:t>URL: upload://SIPCS_Parametro_Integracao_DI_Mantem_Parametro_Mensagem_Digital.doc</w:t>
       </w:r>
     </w:p>
     <w:p>
@@ -41,27 +41,17 @@
           <w:color w:val="FF6600"/>
           <w:sz w:val="20"/>
         </w:rPr>
-        <w:t>Observação: Importado do arquivo Word: SIPCS_Msg_Sistema.doc | Arquivo recebido: SIPCS_Msg_Sistema.doc | Formato DOC legado detectado. | Tentando detectar LibreOffice em: soffice | Tentando detectar LibreOffice em: C:\Program Files\LibreOffice\program\soffice.exe | Tentando detectar LibreOffice em: C:\Program Files (x86)\LibreOffice\program\soffice.exe | LibreOffice indisponivel nos caminhos avaliados. | Fallback direto para parser DOC habilitado.</w:t>
-      </w:r>
-    </w:p>
-    <w:p>
-      <w:r>
-        <w:rPr>
-          <w:sz w:val="22"/>
-        </w:rPr>
-        <w:t>SIPCS – Sistema de Processamento de Cartões e Serviços
-Mensagens do Sistema
-Versão 29.2
-Histórico de Revisões
-Data	Versão	Descrição	Autor
-01/06/2013	1.0	Criação do artefato.	Indra Brasil
-02/04/2014		Inclusão da MA029.
-03/04/2014		Inclusão das mensagens MA065, MA066 e MA067.
-08/03/2014		Inclusão da mensagem MA068.
-10/04/2014		Inclusão da mensagem MA069.
-17/06/2014		Inclusão MN083, MA074 e MA075.	Indra Brasil
-26/06/2014		Inclusão das mensagens MN084 a MN107.	Indra Brasil
-02/07/2014		Inclusão das m...</w:t>
+        <w:t>Observação: Importado do arquivo Word: SIPCS_Parametro_Integracao_DI_Mantem_Parametro_Mensagem_Digital.doc | Arquivo recebido: SIPCS_Parametro_Integracao_DI_Mantem_Parametro_Mensagem_Digital.doc | Formato DOC legado detectado. | Tentando detectar LibreOffice em: soffice | Tentando detectar LibreOffice em: C:\Program Files\LibreOffice\program\soffice.exe | Tentando detectar LibreOffice em: C:\Program Files (x86)\LibreOffice\program\soffice.exe | LibreOffice indisponivel nos caminhos avaliados. | Fallback direto para parser DOC habilitado.</w:t>
+      </w:r>
+    </w:p>
+    <w:p>
+      <w:r>
+        <w:rPr>
+          <w:i w:val="true"/>
+          <w:color w:val="666666"/>
+          <w:sz w:val="20"/>
+        </w:rPr>
+        <w:t>Modo DI: priorizando imagens e conteúdo visual relevante ao front.</w:t>
       </w:r>
     </w:p>
     <w:p>
@@ -123,7 +113,7 @@
           <w:color w:val="666666"/>
           <w:sz w:val="18"/>
         </w:rPr>
-        <w:t>Descrição: 1c01b.emf</w:t>
+        <w:t>Descrição: a8f.png</w:t>
       </w:r>
     </w:p>
     <w:p>
@@ -183,61 +173,16 @@
           <w:color w:val="666666"/>
           <w:sz w:val="18"/>
         </w:rPr>
-        <w:t>Descrição: 1cc69.emf</w:t>
-      </w:r>
-    </w:p>
-    <w:p>
-      <w:pPr>
-        <w:ind w:left="720"/>
-      </w:pPr>
-      <w:r/>
-    </w:p>
-    <w:p/>
-    <w:p/>
-    <w:p>
-      <w:pPr>
-        <w:pageBreakBefore w:val="false"/>
-      </w:pPr>
-    </w:p>
-    <w:p>
-      <w:r>
-        <w:rPr>
-          <w:b w:val="true"/>
-          <w:color w:val="0066CC"/>
-          <w:sz w:val="24"/>
-        </w:rPr>
-        <w:t>URL: upload://SIPCS_Parametro_Integracao_DI_Mantem_Parametro_Mensagem_Digital.doc</w:t>
-      </w:r>
-    </w:p>
-    <w:p>
-      <w:r>
-        <w:rPr>
-          <w:i w:val="true"/>
-          <w:color w:val="FF6600"/>
-          <w:sz w:val="20"/>
-        </w:rPr>
-        <w:t>Observação: Importado do arquivo Word: SIPCS_Parametro_Integracao_DI_Mantem_Parametro_Mensagem_Digital.doc | Arquivo recebido: SIPCS_Parametro_Integracao_DI_Mantem_Parametro_Mensagem_Digital.doc | Formato DOC legado detectado. | Tentando detectar LibreOffice em: soffice | Tentando detectar LibreOffice em: C:\Program Files\LibreOffice\program\soffice.exe | Tentando detectar LibreOffice em: C:\Program Files (x86)\LibreOffice\program\soffice.exe | LibreOffice indisponivel nos caminhos avaliados. | Fallback direto para parser DOC habilitado.</w:t>
-      </w:r>
-    </w:p>
-    <w:p>
-      <w:r>
-        <w:rPr>
-          <w:i w:val="true"/>
-          <w:color w:val="666666"/>
-          <w:sz w:val="20"/>
-        </w:rPr>
-        <w:t>Modo DI: priorizando imagens e conteúdo visual relevante ao front.</w:t>
-      </w:r>
-    </w:p>
-    <w:p>
-      <w:r>
-        <w:rPr>
-          <w:b w:val="true"/>
-          <w:sz w:val="22"/>
-        </w:rPr>
-        <w:t>Imagens encontradas:</w:t>
-      </w:r>
-    </w:p>
+        <w:t>Descrição: 30e90.png</w:t>
+      </w:r>
+    </w:p>
+    <w:p>
+      <w:pPr>
+        <w:ind w:left="720"/>
+      </w:pPr>
+      <w:r/>
+    </w:p>
+    <w:p/>
     <w:p>
       <w:pPr>
         <w:ind w:left="720"/>
@@ -288,7 +233,7 @@
           <w:color w:val="666666"/>
           <w:sz w:val="18"/>
         </w:rPr>
-        <w:t>Descrição: a8f.png</w:t>
+        <w:t>Descrição: 700be.png</w:t>
       </w:r>
     </w:p>
     <w:p>
@@ -348,7 +293,7 @@
           <w:color w:val="666666"/>
           <w:sz w:val="18"/>
         </w:rPr>
-        <w:t>Descrição: 30e90.png</w:t>
+        <w:t>Descrição: b5f2a.png</w:t>
       </w:r>
     </w:p>
     <w:p>
@@ -408,7 +353,7 @@
           <w:color w:val="666666"/>
           <w:sz w:val="18"/>
         </w:rPr>
-        <w:t>Descrição: 700be.png</w:t>
+        <w:t>Descrição: 100e16.png</w:t>
       </w:r>
     </w:p>
     <w:p>
@@ -468,7 +413,7 @@
           <w:color w:val="666666"/>
           <w:sz w:val="18"/>
         </w:rPr>
-        <w:t>Descrição: b5f2a.png</w:t>
+        <w:t>Descrição: 144b5c.png</w:t>
       </w:r>
     </w:p>
     <w:p>
@@ -528,7 +473,7 @@
           <w:color w:val="666666"/>
           <w:sz w:val="18"/>
         </w:rPr>
-        <w:t>Descrição: 100e16.png</w:t>
+        <w:t>Descrição: 19328a.png</w:t>
       </w:r>
     </w:p>
     <w:p>
@@ -588,7 +533,7 @@
           <w:color w:val="666666"/>
           <w:sz w:val="18"/>
         </w:rPr>
-        <w:t>Descrição: 144b5c.png</w:t>
+        <w:t>Descrição: 1c8766.emf</w:t>
       </w:r>
     </w:p>
     <w:p>
@@ -648,7 +593,7 @@
           <w:color w:val="666666"/>
           <w:sz w:val="18"/>
         </w:rPr>
-        <w:t>Descrição: 19328a.png</w:t>
+        <w:t>Descrição: 1c93b4.emf</w:t>
       </w:r>
     </w:p>
     <w:p>
@@ -677,126 +622,6 @@
                     </pic:cNvPicPr>
                   </pic:nvPicPr>
                   <pic:blipFill>
-                    <a:blip r:embed="rId2"/>
-                    <a:stretch>
-                      <a:fillRect/>
-                    </a:stretch>
-                  </pic:blipFill>
-                  <pic:spPr>
-                    <a:xfrm>
-                      <a:off x="0" y="0"/>
-                      <a:ext cx="4572000" cy="3429000"/>
-                    </a:xfrm>
-                    <a:prstGeom prst="rect">
-                      <a:avLst/>
-                    </a:prstGeom>
-                  </pic:spPr>
-                </pic:pic>
-              </a:graphicData>
-            </a:graphic>
-          </wp:inline>
-        </w:drawing>
-      </w:r>
-    </w:p>
-    <w:p>
-      <w:pPr>
-        <w:ind w:left="720"/>
-      </w:pPr>
-      <w:r>
-        <w:rPr>
-          <w:i w:val="true"/>
-          <w:color w:val="666666"/>
-          <w:sz w:val="18"/>
-        </w:rPr>
-        <w:t>Descrição: 1c8766.emf</w:t>
-      </w:r>
-    </w:p>
-    <w:p>
-      <w:pPr>
-        <w:ind w:left="720"/>
-      </w:pPr>
-      <w:r/>
-    </w:p>
-    <w:p/>
-    <w:p>
-      <w:pPr>
-        <w:ind w:left="720"/>
-      </w:pPr>
-      <w:r>
-        <w:drawing>
-          <wp:inline distT="0" distR="0" distB="0" distL="0">
-            <wp:extent cx="4572000" cy="3429000"/>
-            <wp:docPr id="10" name="Drawing 10" descr="imagem"/>
-            <a:graphic xmlns:a="http://schemas.openxmlformats.org/drawingml/2006/main">
-              <a:graphicData uri="http://schemas.openxmlformats.org/drawingml/2006/picture">
-                <pic:pic xmlns:pic="http://schemas.openxmlformats.org/drawingml/2006/picture">
-                  <pic:nvPicPr>
-                    <pic:cNvPr id="0" name="Picture 10" descr="imagem"/>
-                    <pic:cNvPicPr>
-                      <a:picLocks noChangeAspect="true"/>
-                    </pic:cNvPicPr>
-                  </pic:nvPicPr>
-                  <pic:blipFill>
-                    <a:blip r:embed="rId3"/>
-                    <a:stretch>
-                      <a:fillRect/>
-                    </a:stretch>
-                  </pic:blipFill>
-                  <pic:spPr>
-                    <a:xfrm>
-                      <a:off x="0" y="0"/>
-                      <a:ext cx="4572000" cy="3429000"/>
-                    </a:xfrm>
-                    <a:prstGeom prst="rect">
-                      <a:avLst/>
-                    </a:prstGeom>
-                  </pic:spPr>
-                </pic:pic>
-              </a:graphicData>
-            </a:graphic>
-          </wp:inline>
-        </w:drawing>
-      </w:r>
-    </w:p>
-    <w:p>
-      <w:pPr>
-        <w:ind w:left="720"/>
-      </w:pPr>
-      <w:r>
-        <w:rPr>
-          <w:i w:val="true"/>
-          <w:color w:val="666666"/>
-          <w:sz w:val="18"/>
-        </w:rPr>
-        <w:t>Descrição: 1c93b4.emf</w:t>
-      </w:r>
-    </w:p>
-    <w:p>
-      <w:pPr>
-        <w:ind w:left="720"/>
-      </w:pPr>
-      <w:r/>
-    </w:p>
-    <w:p/>
-    <w:p>
-      <w:pPr>
-        <w:ind w:left="720"/>
-      </w:pPr>
-      <w:r>
-        <w:drawing>
-          <wp:inline distT="0" distR="0" distB="0" distL="0">
-            <wp:extent cx="4572000" cy="3429000"/>
-            <wp:docPr id="11" name="Drawing 11" descr="imagem"/>
-            <a:graphic xmlns:a="http://schemas.openxmlformats.org/drawingml/2006/main">
-              <a:graphicData uri="http://schemas.openxmlformats.org/drawingml/2006/picture">
-                <pic:pic xmlns:pic="http://schemas.openxmlformats.org/drawingml/2006/picture">
-                  <pic:nvPicPr>
-                    <pic:cNvPr id="0" name="Picture 11" descr="imagem"/>
-                    <pic:cNvPicPr>
-                      <a:picLocks noChangeAspect="true"/>
-                    </pic:cNvPicPr>
-                  </pic:nvPicPr>
-                  <pic:blipFill>
                     <a:blip r:embed="rId11"/>
                     <a:stretch>
                       <a:fillRect/>
@@ -829,180 +654,6 @@
           <w:sz w:val="18"/>
         </w:rPr>
         <w:t>Descrição: 1ca2fd.png</w:t>
-      </w:r>
-    </w:p>
-    <w:p>
-      <w:pPr>
-        <w:ind w:left="720"/>
-      </w:pPr>
-      <w:r/>
-    </w:p>
-    <w:p/>
-    <w:p/>
-    <w:p>
-      <w:pPr>
-        <w:pageBreakBefore w:val="false"/>
-      </w:pPr>
-    </w:p>
-    <w:p>
-      <w:r>
-        <w:rPr>
-          <w:b w:val="true"/>
-          <w:color w:val="0066CC"/>
-          <w:sz w:val="24"/>
-        </w:rPr>
-        <w:t>URL: upload://SIPCS_Parametro_Integracao_UC_Mantem_Parametro_Mensagem_Digital.doc</w:t>
-      </w:r>
-    </w:p>
-    <w:p>
-      <w:r>
-        <w:rPr>
-          <w:i w:val="true"/>
-          <w:color w:val="FF6600"/>
-          <w:sz w:val="20"/>
-        </w:rPr>
-        <w:t>Observação: Importado do arquivo Word: SIPCS_Parametro_Integracao_UC_Mantem_Parametro_Mensagem_Digital.doc | Arquivo recebido: SIPCS_Parametro_Integracao_UC_Mantem_Parametro_Mensagem_Digital.doc | Formato DOC legado detectado. | Tentando detectar LibreOffice em: soffice | Tentando detectar LibreOffice em: C:\Program Files\LibreOffice\program\soffice.exe | Tentando detectar LibreOffice em: C:\Program Files (x86)\LibreOffice\program\soffice.exe | LibreOffice indisponivel nos caminhos avaliados. | Fallback direto para parser DOC habilitado.</w:t>
-      </w:r>
-    </w:p>
-    <w:p>
-      <w:r>
-        <w:rPr>
-          <w:sz w:val="22"/>
-        </w:rPr>
-        <w:t>___________________________________________________________________
-SIPCS – Sistema de Processamento de Cartões e Serviços
-Especificação de Caso de Uso
-Mantém Parâmetro de Mensagem Digital
-Versão 1.0
-HISTÓRICO DE REVISÕES
-Data	Versão	Descrição	Autor
-09/04/2026	1.0	Especificação inicial do artefato em atendimento ao RTC 24823240 - Super App - Mini App Cartões Onda 2 - Inclusão de Parametrização de Mensagens para Uso dos Canais.	Indra
-Sumário
-TOC \o "1-2" \h \z \u 1.	Descrição	4
-2.	Atores	4
-2.1.	C...</w:t>
-      </w:r>
-    </w:p>
-    <w:p>
-      <w:r>
-        <w:rPr>
-          <w:b w:val="true"/>
-          <w:sz w:val="22"/>
-        </w:rPr>
-        <w:t>Imagens encontradas:</w:t>
-      </w:r>
-    </w:p>
-    <w:p>
-      <w:pPr>
-        <w:ind w:left="720"/>
-      </w:pPr>
-      <w:r>
-        <w:drawing>
-          <wp:inline distT="0" distR="0" distB="0" distL="0">
-            <wp:extent cx="4572000" cy="3429000"/>
-            <wp:docPr id="12" name="Drawing 12" descr="imagem"/>
-            <a:graphic xmlns:a="http://schemas.openxmlformats.org/drawingml/2006/main">
-              <a:graphicData uri="http://schemas.openxmlformats.org/drawingml/2006/picture">
-                <pic:pic xmlns:pic="http://schemas.openxmlformats.org/drawingml/2006/picture">
-                  <pic:nvPicPr>
-                    <pic:cNvPr id="0" name="Picture 12" descr="imagem"/>
-                    <pic:cNvPicPr>
-                      <a:picLocks noChangeAspect="true"/>
-                    </pic:cNvPicPr>
-                  </pic:nvPicPr>
-                  <pic:blipFill>
-                    <a:blip r:embed="rId12"/>
-                    <a:stretch>
-                      <a:fillRect/>
-                    </a:stretch>
-                  </pic:blipFill>
-                  <pic:spPr>
-                    <a:xfrm>
-                      <a:off x="0" y="0"/>
-                      <a:ext cx="4572000" cy="3429000"/>
-                    </a:xfrm>
-                    <a:prstGeom prst="rect">
-                      <a:avLst/>
-                    </a:prstGeom>
-                  </pic:spPr>
-                </pic:pic>
-              </a:graphicData>
-            </a:graphic>
-          </wp:inline>
-        </w:drawing>
-      </w:r>
-    </w:p>
-    <w:p>
-      <w:pPr>
-        <w:ind w:left="720"/>
-      </w:pPr>
-      <w:r>
-        <w:rPr>
-          <w:i w:val="true"/>
-          <w:color w:val="666666"/>
-          <w:sz w:val="18"/>
-        </w:rPr>
-        <w:t>Descrição: 512d.png</w:t>
-      </w:r>
-    </w:p>
-    <w:p>
-      <w:pPr>
-        <w:ind w:left="720"/>
-      </w:pPr>
-      <w:r/>
-    </w:p>
-    <w:p/>
-    <w:p>
-      <w:pPr>
-        <w:ind w:left="720"/>
-      </w:pPr>
-      <w:r>
-        <w:drawing>
-          <wp:inline distT="0" distR="0" distB="0" distL="0">
-            <wp:extent cx="4572000" cy="3429000"/>
-            <wp:docPr id="13" name="Drawing 13" descr="imagem"/>
-            <a:graphic xmlns:a="http://schemas.openxmlformats.org/drawingml/2006/main">
-              <a:graphicData uri="http://schemas.openxmlformats.org/drawingml/2006/picture">
-                <pic:pic xmlns:pic="http://schemas.openxmlformats.org/drawingml/2006/picture">
-                  <pic:nvPicPr>
-                    <pic:cNvPr id="0" name="Picture 13" descr="imagem"/>
-                    <pic:cNvPicPr>
-                      <a:picLocks noChangeAspect="true"/>
-                    </pic:cNvPicPr>
-                  </pic:nvPicPr>
-                  <pic:blipFill>
-                    <a:blip r:embed="rId3"/>
-                    <a:stretch>
-                      <a:fillRect/>
-                    </a:stretch>
-                  </pic:blipFill>
-                  <pic:spPr>
-                    <a:xfrm>
-                      <a:off x="0" y="0"/>
-                      <a:ext cx="4572000" cy="3429000"/>
-                    </a:xfrm>
-                    <a:prstGeom prst="rect">
-                      <a:avLst/>
-                    </a:prstGeom>
-                  </pic:spPr>
-                </pic:pic>
-              </a:graphicData>
-            </a:graphic>
-          </wp:inline>
-        </w:drawing>
-      </w:r>
-    </w:p>
-    <w:p>
-      <w:pPr>
-        <w:ind w:left="720"/>
-      </w:pPr>
-      <w:r>
-        <w:rPr>
-          <w:i w:val="true"/>
-          <w:color w:val="666666"/>
-          <w:sz w:val="18"/>
-        </w:rPr>
-        <w:t>Descrição: 5a72.emf</w:t>
       </w:r>
     </w:p>
     <w:p>

</xml_diff>